<commit_message>
Complete Rev D production handoff
</commit_message>
<xml_diff>
--- a/releases/evt-pre-20/2026-09-30-rev-d/Заказ_плат_и_монтаж/00_Условия_передачи/Задание_на_изготовление_и_монтаж_плат.docx
+++ b/releases/evt-pre-20/2026-09-30-rev-d/Заказ_плат_и_монтаж/00_Условия_передачи/Задание_на_изготовление_и_монтаж_плат.docx
@@ -34,7 +34,7 @@
     <w:p>
       <w:pPr/>
       <w:r>
-        <w:t>Плата разведена: DRC 0 ошибок, 0 незавершённых соединений, ERC 0. Заказ выполняется после DFM фабрики и подтверждения stack ID/материалов/переходных отверстий по официальной технологической карте фабрики. В партии 20 PCBA; U12 microSD устанавливается вне платы; DNP — 15 позиций.</w:t>
+        <w:t>Плата разведена: DRC 0 ошибок, 0 незавершённых соединений, ERC 0. Заказ выполняется после DFM фабрики и подтверждения stack ID/материалов/переходных отверстий по официальной технологической карте фабрики. Заказать 22 PCBA: 20 для станций и 2 резервные. U12 microSD устанавливается вне платы; DNP — 15 позиций. Базис: 8 слоёв, 1,6 мм, ENIG, 1 oz наружной и 0,5 oz внутренней меди, POFV для 74 отмеченных переходов; фактический стек и импеданс подтвердить в DFM.</w:t>
       </w:r>
     </w:p>
     <w:p>
@@ -48,7 +48,7 @@
     <w:p>
       <w:pPr/>
       <w:r>
-        <w:t>Заказ разрешён заказчиком с заводской DFM-проверкой. Фабрика подтверждает фактический стек, металлизацию переходных отверстий и отклонения; изменения файлов проходят ECO.</w:t>
+        <w:t>Заказать 22 PCBA: 20 для станций и 2 резервные. Базис JLC04161H-3313A: четыре слоя, 1,6 мм, ENIG, наружная медь 2 oz / 70 мкм, внутренняя 1 oz / 35 мкм. Фабрика подтверждает фактический stack ID, металлизацию переходных отверстий и DFM; изменения файлов проходят ECO.</w:t>
       </w:r>
     </w:p>
     <w:p>

</xml_diff>

<commit_message>
Rev D: align full PCB lot order and procurement summary
</commit_message>
<xml_diff>
--- a/releases/evt-pre-20/2026-09-30-rev-d/Заказ_плат_и_монтаж/00_Условия_передачи/Задание_на_изготовление_и_монтаж_плат.docx
+++ b/releases/evt-pre-20/2026-09-30-rev-d/Заказ_плат_и_монтаж/00_Условия_передачи/Задание_на_изготовление_и_монтаж_плат.docx
@@ -75,7 +75,7 @@
           <w:rFonts w:ascii="Times New Roman" w:hAnsi="Times New Roman" w:eastAsia="Times New Roman" w:cs="Times New Roman"/>
           <w:sz w:val="28"/>
         </w:rPr>
-        <w:t>Плата PCB-MAIN разведена: DRC 0 ошибок, 0 незавершённых соединений, ERC 0. Заказать 22 PCBA, из них сначала 2 первых изделия для DFM, AOI и электрических испытаний; остальные 20 запускать после приёмки. U12 microSD устанавливается вне платы; DNP: 15 позиций. Базис платы: 8 слоёв, 1,6 мм, ENIG, 1 oz наружной и 0,5 oz внутренней меди. Заказной CSV VIA_FILL_CAP_76_ORDER_REV_D.csv и карта задают заполнение эпоксидом и медное закрытие 76 переходов: 74 отмечены в исходной плате и 2 заданы как CAM-дополнение у C6.1 и D11.1. Фабрика должна письменно подтвердить выполнение 76 из 76 точек до запуска панели. Фактический stack ID, межслойные диэлектрики и решение по импедансу фиксируются при DFM; отклонения оформляются ECO.</w:t>
+        <w:t>Плата PCB-MAIN разведена: DRC 0 ошибок, 0 незавершённых соединений, ERC 0. Заказать и изготовить все 22 PCBA одной партией без паузы; два изделия выбрать из готовой партии для углублённого AOI, электрических и ВЧ-испытаний EVT. U12 microSD вне платы; DNP: 15 позиций. Базис: 8 слоёв, 1,6 мм, ENIG, 1 oz наружной и 0,5 oz внутренней меди. Фабрика письменно подтверждает заполнение эпоксидом и медное закрытие всех 76 переходов из заказного CSV, включая C6.1 и D11.1, до запуска панели. По решению заказчика на EVT плата остаётся без переразводки; контролируемый импеданс и численная цель 50 Ом не заказываются. Ширина ВЧ-дорожек не является гарантией 50 Ом. Фактический stack ID и межслойные диэлектрики фиксируются при DFM; отклонения проходят ECO.</w:t>
       </w:r>
     </w:p>
     <w:p>
@@ -106,14 +106,7 @@
           <w:rFonts w:ascii="Times New Roman" w:hAnsi="Times New Roman" w:eastAsia="Times New Roman" w:cs="Times New Roman"/>
           <w:sz w:val="28"/>
         </w:rPr>
-        <w:t>Заказать 22 PCBA: 20 для станций и 2 резервные. Базис: четыре слоя, 1,6 мм, ENIG, медь 1 oz / 35 мкм на всех четырёх слоях. Фабрика подтверждает фактический stack ID, металлизацию переходных отверстий и DFM; изменения файлов проходят ECO.</w:t>
-      </w:r>
-      <w:r>
-        <w:rPr>
-          <w:rFonts w:ascii="Times New Roman" w:hAnsi="Times New Roman" w:eastAsia="Times New Roman" w:cs="Times New Roman"/>
-          <w:sz w:val="28"/>
-        </w:rPr>
-        <w:t xml:space="preserve"> Первые два изделия проходят отдельную проверку DFM, AOI и электрических испытаний; после приёмки выпускаются остальные 20.</w:t>
+        <w:t>Заказать и изготовить все 22 PCB-PWR PCBA одной партией без паузы: 20 для станций и 2 резервные. Базис: четыре слоя, 1,6 мм, ENIG, медь 1 oz / 35 мкм на всех четырёх слоях. До панели фабрика подтверждает stack ID, металлизацию переходных отверстий и DFM. После изготовления два изделия выбираются для углублённого AOI и электрического контроля; при дефектах рассматривается вся затронутая партия.</w:t>
       </w:r>
     </w:p>
     <w:p>
@@ -144,7 +137,7 @@
           <w:rFonts w:ascii="Times New Roman" w:hAnsi="Times New Roman" w:eastAsia="Times New Roman" w:cs="Times New Roman"/>
           <w:sz w:val="28"/>
         </w:rPr>
-        <w:t>Review B принят для управляемого выпуска. Заказать 80 PCBA по Rev B: сначала одна плата или панель, затем остальные 79 после проверки акустического отверстия, MK1 и PDM. DRC/ERC/unconnected – 0/0/0.</w:t>
+        <w:t>Заказать и изготовить все 80 PCB-MIC PCBA одной партией без паузы. Геометрия Rev B и технические проверки подписанного Review B сохраняются. Условие Review B о выпуске сначала одной платы или панели заменено требованием заказчика к очередности заказа; новая подпись технического Review B не создаётся. После изготовления проверить выбранную плату или панель по акустическому порту, MK1 и PDM, а при дефекте разобрать всю затронутую партию. DRC/ERC/unconnected: 0/0/0.</w:t>
       </w:r>
     </w:p>
     <w:p>

</xml_diff>